<commit_message>
some minor CV changes
</commit_message>
<xml_diff>
--- a/static/cv/Dhuppar_CV.docx
+++ b/static/cv/Dhuppar_CV.docx
@@ -2671,6 +2671,257 @@
                 <w:sz w:val="21"/>
                 <w:szCs w:val="21"/>
               </w:rPr>
+              <w:t>2026</w:t>
+            </w:r>
+          </w:p>
+        </w:tc>
+        <w:tc>
+          <w:tcPr>
+            <w:tcW w:w="9072" w:type="dxa"/>
+          </w:tcPr>
+          <w:p>
+            <w:pPr>
+              <w:pStyle w:val="ListBullet"/>
+              <w:numPr>
+                <w:ilvl w:val="0"/>
+                <w:numId w:val="0"/>
+              </w:numPr>
+              <w:spacing w:after="60"/>
+              <w:rPr>
+                <w:rFonts w:ascii="Times New Roman" w:hAnsi="Times New Roman" w:cs="Times New Roman"/>
+                <w:b/>
+                <w:bCs/>
+                <w:color w:val="404040" w:themeColor="text1" w:themeTint="BF"/>
+                <w:sz w:val="21"/>
+                <w:szCs w:val="21"/>
+              </w:rPr>
+            </w:pPr>
+            <w:r>
+              <w:rPr>
+                <w:rFonts w:ascii="Times New Roman" w:hAnsi="Times New Roman" w:cs="Times New Roman"/>
+                <w:b/>
+                <w:bCs/>
+                <w:color w:val="404040" w:themeColor="text1" w:themeTint="BF"/>
+                <w:sz w:val="21"/>
+                <w:szCs w:val="21"/>
+              </w:rPr>
+              <w:t xml:space="preserve">Biology of Adversity Project </w:t>
+            </w:r>
+            <w:r>
+              <w:rPr>
+                <w:rFonts w:ascii="Times New Roman" w:hAnsi="Times New Roman" w:cs="Times New Roman"/>
+                <w:b/>
+                <w:bCs/>
+                <w:color w:val="404040" w:themeColor="text1" w:themeTint="BF"/>
+                <w:sz w:val="21"/>
+                <w:szCs w:val="21"/>
+              </w:rPr>
+              <w:t>@ the Broad Institute of MIT and Harvard</w:t>
+            </w:r>
+          </w:p>
+          <w:p>
+            <w:pPr>
+              <w:pStyle w:val="ListBullet"/>
+              <w:numPr>
+                <w:ilvl w:val="0"/>
+                <w:numId w:val="0"/>
+              </w:numPr>
+              <w:spacing w:after="60"/>
+              <w:rPr>
+                <w:rFonts w:ascii="Times New Roman" w:hAnsi="Times New Roman" w:cs="Times New Roman"/>
+                <w:b/>
+                <w:bCs/>
+                <w:color w:val="404040" w:themeColor="text1" w:themeTint="BF"/>
+                <w:sz w:val="21"/>
+                <w:szCs w:val="21"/>
+              </w:rPr>
+            </w:pPr>
+            <w:r>
+              <w:rPr>
+                <w:rFonts w:ascii="Times New Roman" w:hAnsi="Times New Roman" w:cs="Times New Roman"/>
+                <w:color w:val="404040" w:themeColor="text1" w:themeTint="BF"/>
+                <w:sz w:val="21"/>
+                <w:szCs w:val="21"/>
+              </w:rPr>
+              <w:t>Talk:</w:t>
+            </w:r>
+            <w:r>
+              <w:rPr>
+                <w:rFonts w:ascii="Times New Roman" w:hAnsi="Times New Roman" w:cs="Times New Roman"/>
+                <w:b/>
+                <w:bCs/>
+                <w:color w:val="404040" w:themeColor="text1" w:themeTint="BF"/>
+                <w:sz w:val="21"/>
+                <w:szCs w:val="21"/>
+              </w:rPr>
+              <w:t xml:space="preserve"> </w:t>
+            </w:r>
+            <w:r>
+              <w:rPr>
+                <w:rFonts w:ascii="Times New Roman" w:hAnsi="Times New Roman" w:cs="Times New Roman"/>
+                <w:i/>
+                <w:iCs/>
+                <w:color w:val="404040" w:themeColor="text1" w:themeTint="BF"/>
+                <w:sz w:val="21"/>
+                <w:szCs w:val="21"/>
+              </w:rPr>
+              <w:t>Prenatal Stress: Mitigating Long-Term Health Risks—Preclinical Studies, observations, and interventions</w:t>
+            </w:r>
+          </w:p>
+        </w:tc>
+      </w:tr>
+      <w:tr>
+        <w:tc>
+          <w:tcPr>
+            <w:tcW w:w="1418" w:type="dxa"/>
+          </w:tcPr>
+          <w:p>
+            <w:pPr>
+              <w:pStyle w:val="ListBullet"/>
+              <w:numPr>
+                <w:ilvl w:val="0"/>
+                <w:numId w:val="0"/>
+              </w:numPr>
+              <w:spacing w:after="60"/>
+              <w:jc w:val="right"/>
+              <w:rPr>
+                <w:rFonts w:ascii="Times New Roman" w:hAnsi="Times New Roman" w:cs="Times New Roman"/>
+                <w:b/>
+                <w:bCs/>
+                <w:color w:val="404040" w:themeColor="text1" w:themeTint="BF"/>
+                <w:sz w:val="21"/>
+                <w:szCs w:val="21"/>
+              </w:rPr>
+            </w:pPr>
+            <w:r>
+              <w:rPr>
+                <w:rFonts w:ascii="Times New Roman" w:hAnsi="Times New Roman" w:cs="Times New Roman"/>
+                <w:b/>
+                <w:bCs/>
+                <w:color w:val="404040" w:themeColor="text1" w:themeTint="BF"/>
+                <w:sz w:val="21"/>
+                <w:szCs w:val="21"/>
+              </w:rPr>
+              <w:t>2024</w:t>
+            </w:r>
+          </w:p>
+        </w:tc>
+        <w:tc>
+          <w:tcPr>
+            <w:tcW w:w="9072" w:type="dxa"/>
+          </w:tcPr>
+          <w:p>
+            <w:pPr>
+              <w:pStyle w:val="ListBullet"/>
+              <w:numPr>
+                <w:ilvl w:val="0"/>
+                <w:numId w:val="0"/>
+              </w:numPr>
+              <w:spacing w:after="60"/>
+              <w:rPr>
+                <w:rFonts w:ascii="Times New Roman" w:hAnsi="Times New Roman" w:cs="Times New Roman"/>
+                <w:b/>
+                <w:bCs/>
+                <w:color w:val="404040" w:themeColor="text1" w:themeTint="BF"/>
+                <w:sz w:val="21"/>
+                <w:szCs w:val="21"/>
+              </w:rPr>
+            </w:pPr>
+            <w:r>
+              <w:rPr>
+                <w:rFonts w:ascii="Times New Roman" w:hAnsi="Times New Roman" w:cs="Times New Roman"/>
+                <w:b/>
+                <w:bCs/>
+                <w:color w:val="404040" w:themeColor="text1" w:themeTint="BF"/>
+                <w:sz w:val="21"/>
+                <w:szCs w:val="21"/>
+              </w:rPr>
+              <w:t>Proteomics @ the Broad Institute of MIT and Harvard</w:t>
+            </w:r>
+          </w:p>
+          <w:p>
+            <w:pPr>
+              <w:pStyle w:val="ListBullet"/>
+              <w:numPr>
+                <w:ilvl w:val="0"/>
+                <w:numId w:val="0"/>
+              </w:numPr>
+              <w:spacing w:after="60"/>
+              <w:rPr>
+                <w:rFonts w:ascii="Times New Roman" w:hAnsi="Times New Roman" w:cs="Times New Roman"/>
+                <w:b/>
+                <w:bCs/>
+                <w:color w:val="404040" w:themeColor="text1" w:themeTint="BF"/>
+                <w:sz w:val="21"/>
+                <w:szCs w:val="21"/>
+              </w:rPr>
+            </w:pPr>
+            <w:r>
+              <w:rPr>
+                <w:rFonts w:ascii="Times New Roman" w:hAnsi="Times New Roman" w:cs="Times New Roman"/>
+                <w:color w:val="404040" w:themeColor="text1" w:themeTint="BF"/>
+                <w:sz w:val="21"/>
+                <w:szCs w:val="21"/>
+              </w:rPr>
+              <w:t>Talk:</w:t>
+            </w:r>
+            <w:r>
+              <w:rPr>
+                <w:rFonts w:ascii="Times New Roman" w:hAnsi="Times New Roman" w:cs="Times New Roman"/>
+                <w:b/>
+                <w:bCs/>
+                <w:color w:val="404040" w:themeColor="text1" w:themeTint="BF"/>
+                <w:sz w:val="21"/>
+                <w:szCs w:val="21"/>
+              </w:rPr>
+              <w:t xml:space="preserve"> </w:t>
+            </w:r>
+            <w:r>
+              <w:rPr>
+                <w:rFonts w:ascii="Times New Roman" w:hAnsi="Times New Roman" w:cs="Times New Roman"/>
+                <w:i/>
+                <w:iCs/>
+                <w:color w:val="404040" w:themeColor="text1" w:themeTint="BF"/>
+                <w:sz w:val="21"/>
+                <w:szCs w:val="21"/>
+              </w:rPr>
+              <w:t>Quantitative Microscopy for Capturing Biological Insights</w:t>
+            </w:r>
+          </w:p>
+        </w:tc>
+      </w:tr>
+      <w:tr>
+        <w:tc>
+          <w:tcPr>
+            <w:tcW w:w="1418" w:type="dxa"/>
+          </w:tcPr>
+          <w:p>
+            <w:pPr>
+              <w:pStyle w:val="ListBullet"/>
+              <w:numPr>
+                <w:ilvl w:val="0"/>
+                <w:numId w:val="0"/>
+              </w:numPr>
+              <w:spacing w:after="60"/>
+              <w:jc w:val="right"/>
+              <w:rPr>
+                <w:rFonts w:ascii="Times New Roman" w:hAnsi="Times New Roman" w:cs="Times New Roman"/>
+                <w:b/>
+                <w:bCs/>
+                <w:color w:val="404040" w:themeColor="text1" w:themeTint="BF"/>
+                <w:sz w:val="21"/>
+                <w:szCs w:val="21"/>
+              </w:rPr>
+            </w:pPr>
+            <w:r>
+              <w:rPr>
+                <w:rFonts w:ascii="Times New Roman" w:hAnsi="Times New Roman" w:cs="Times New Roman"/>
+                <w:b/>
+                <w:bCs/>
+                <w:color w:val="404040" w:themeColor="text1" w:themeTint="BF"/>
+                <w:sz w:val="21"/>
+                <w:szCs w:val="21"/>
+              </w:rPr>
               <w:t>2019</w:t>
             </w:r>
           </w:p>
@@ -4115,6 +4366,7 @@
                 <w:sz w:val="21"/>
                 <w:szCs w:val="21"/>
               </w:rPr>
+              <w:lastRenderedPageBreak/>
               <w:t>2020</w:t>
             </w:r>
           </w:p>
@@ -4337,7 +4589,6 @@
                 <w:sz w:val="21"/>
                 <w:szCs w:val="21"/>
               </w:rPr>
-              <w:lastRenderedPageBreak/>
               <w:t>S. Dhuppar*</w:t>
             </w:r>
             <w:r>
@@ -4384,7 +4635,6 @@
                 <w:sz w:val="21"/>
                 <w:szCs w:val="21"/>
               </w:rPr>
-              <w:lastRenderedPageBreak/>
               <w:t>2020</w:t>
             </w:r>
           </w:p>
@@ -7243,6 +7493,9 @@
     <w:abstractNumId w:val="14"/>
   </w:num>
   <w:num w:numId="21" w16cid:durableId="1721635219">
+    <w:abstractNumId w:val="14"/>
+  </w:num>
+  <w:num w:numId="22" w16cid:durableId="1476949083">
     <w:abstractNumId w:val="14"/>
   </w:num>
 </w:numbering>
@@ -8132,7 +8385,6 @@
     <w:name w:val="Emphasis"/>
     <w:basedOn w:val="DefaultParagraphFont"/>
     <w:uiPriority w:val="20"/>
-    <w:semiHidden/>
     <w:unhideWhenUsed/>
     <w:qFormat/>
     <w:rPr>

</xml_diff>

<commit_message>
some more minor CV changes
</commit_message>
<xml_diff>
--- a/static/cv/Dhuppar_CV.docx
+++ b/static/cv/Dhuppar_CV.docx
@@ -233,30 +233,14 @@
               <w:rPr>
                 <w:rFonts w:ascii="Times New Roman" w:hAnsi="Times New Roman" w:cs="Times New Roman"/>
               </w:rPr>
-              <w:t>github.com/</w:t>
-            </w:r>
-            <w:proofErr w:type="spellStart"/>
-            <w:r>
-              <w:rPr>
-                <w:rFonts w:ascii="Times New Roman" w:hAnsi="Times New Roman" w:cs="Times New Roman"/>
-              </w:rPr>
-              <w:t>shuppar</w:t>
-            </w:r>
-            <w:proofErr w:type="spellEnd"/>
-            <w:r>
-              <w:rPr>
-                <w:rFonts w:ascii="Times New Roman" w:hAnsi="Times New Roman" w:cs="Times New Roman"/>
-              </w:rPr>
-              <w:t xml:space="preserve"> | linkedin.com/in/</w:t>
-            </w:r>
-            <w:proofErr w:type="spellStart"/>
-            <w:r>
-              <w:rPr>
-                <w:rFonts w:ascii="Times New Roman" w:hAnsi="Times New Roman" w:cs="Times New Roman"/>
-              </w:rPr>
-              <w:t>shuppar</w:t>
-            </w:r>
-            <w:proofErr w:type="spellEnd"/>
+              <w:t>github.com/shuppar</w:t>
+            </w:r>
+            <w:r>
+              <w:rPr>
+                <w:rFonts w:ascii="Times New Roman" w:hAnsi="Times New Roman" w:cs="Times New Roman"/>
+              </w:rPr>
+              <w:t xml:space="preserve"> | linkedin.com/in/shuppar</w:t>
+            </w:r>
           </w:p>
         </w:tc>
       </w:tr>
@@ -1033,27 +1017,7 @@
                 <w:sz w:val="21"/>
                 <w:szCs w:val="21"/>
               </w:rPr>
-              <w:t xml:space="preserve">miR-92a from the oncogenic </w:t>
-            </w:r>
-            <w:proofErr w:type="spellStart"/>
-            <w:r>
-              <w:rPr>
-                <w:rFonts w:ascii="Times New Roman" w:hAnsi="Times New Roman" w:cs="Times New Roman"/>
-                <w:color w:val="404040" w:themeColor="text1" w:themeTint="BF"/>
-                <w:sz w:val="21"/>
-                <w:szCs w:val="21"/>
-              </w:rPr>
-              <w:t>miR</w:t>
-            </w:r>
-            <w:proofErr w:type="spellEnd"/>
-            <w:r>
-              <w:rPr>
-                <w:rFonts w:ascii="Times New Roman" w:hAnsi="Times New Roman" w:cs="Times New Roman"/>
-                <w:color w:val="404040" w:themeColor="text1" w:themeTint="BF"/>
-                <w:sz w:val="21"/>
-                <w:szCs w:val="21"/>
-              </w:rPr>
-              <w:t xml:space="preserve"> 17-92 cluster is upregulated in many cancers, including colorectal cancer. In this project, I investigated the roles of miR-92a in colitis and colorectal cancer using miR-92a KO mice models.</w:t>
+              <w:t>miR-92a from the oncogenic miR 17-92 cluster is upregulated in many cancers, including colorectal cancer. In this project, I investigated the roles of miR-92a in colitis and colorectal cancer using miR-92a KO mice models.</w:t>
             </w:r>
             <w:r>
               <w:rPr>
@@ -2374,21 +2338,8 @@
                 <w:sz w:val="21"/>
                 <w:szCs w:val="21"/>
               </w:rPr>
-              <w:t xml:space="preserve">Circuits and Electronics (6.002x) from </w:t>
-            </w:r>
-            <w:proofErr w:type="spellStart"/>
-            <w:r>
-              <w:rPr>
-                <w:rFonts w:ascii="Times New Roman" w:hAnsi="Times New Roman" w:cs="Times New Roman"/>
-                <w:b/>
-                <w:bCs/>
-                <w:color w:val="404040" w:themeColor="text1" w:themeTint="BF"/>
-                <w:sz w:val="21"/>
-                <w:szCs w:val="21"/>
-              </w:rPr>
-              <w:t>MITx</w:t>
-            </w:r>
-            <w:proofErr w:type="spellEnd"/>
+              <w:t>Circuits and Electronics (6.002x) from MITx</w:t>
+            </w:r>
           </w:p>
           <w:p>
             <w:pPr>
@@ -2705,18 +2656,7 @@
                 <w:sz w:val="21"/>
                 <w:szCs w:val="21"/>
               </w:rPr>
-              <w:t xml:space="preserve">Biology of Adversity Project </w:t>
-            </w:r>
-            <w:r>
-              <w:rPr>
-                <w:rFonts w:ascii="Times New Roman" w:hAnsi="Times New Roman" w:cs="Times New Roman"/>
-                <w:b/>
-                <w:bCs/>
-                <w:color w:val="404040" w:themeColor="text1" w:themeTint="BF"/>
-                <w:sz w:val="21"/>
-                <w:szCs w:val="21"/>
-              </w:rPr>
-              <w:t>@ the Broad Institute of MIT and Harvard</w:t>
+              <w:t>Biology of Adversity Project @ the Broad Institute of MIT and Harvard</w:t>
             </w:r>
           </w:p>
           <w:p>
@@ -3448,31 +3388,7 @@
                 <w:sz w:val="21"/>
                 <w:szCs w:val="21"/>
               </w:rPr>
-              <w:t xml:space="preserve">Science </w:t>
-            </w:r>
-            <w:proofErr w:type="spellStart"/>
-            <w:r>
-              <w:rPr>
-                <w:rFonts w:ascii="Times New Roman" w:hAnsi="Times New Roman" w:cs="Times New Roman"/>
-                <w:i/>
-                <w:iCs/>
-                <w:color w:val="404040" w:themeColor="text1" w:themeTint="BF"/>
-                <w:sz w:val="21"/>
-                <w:szCs w:val="21"/>
-              </w:rPr>
-              <w:t>Transl</w:t>
-            </w:r>
-            <w:proofErr w:type="spellEnd"/>
-            <w:r>
-              <w:rPr>
-                <w:rFonts w:ascii="Times New Roman" w:hAnsi="Times New Roman" w:cs="Times New Roman"/>
-                <w:i/>
-                <w:iCs/>
-                <w:color w:val="404040" w:themeColor="text1" w:themeTint="BF"/>
-                <w:sz w:val="21"/>
-                <w:szCs w:val="21"/>
-              </w:rPr>
-              <w:t xml:space="preserve"> Med</w:t>
+              <w:t>Science Transl Med</w:t>
             </w:r>
             <w:r>
               <w:rPr>
@@ -3621,27 +3537,7 @@
                 <w:sz w:val="21"/>
                 <w:szCs w:val="21"/>
               </w:rPr>
-              <w:t xml:space="preserve">, W. </w:t>
-            </w:r>
-            <w:proofErr w:type="spellStart"/>
-            <w:r>
-              <w:rPr>
-                <w:rFonts w:ascii="Times New Roman" w:hAnsi="Times New Roman" w:cs="Times New Roman"/>
-                <w:color w:val="404040" w:themeColor="text1" w:themeTint="BF"/>
-                <w:sz w:val="21"/>
-                <w:szCs w:val="21"/>
-              </w:rPr>
-              <w:t>Poller</w:t>
-            </w:r>
-            <w:proofErr w:type="spellEnd"/>
-            <w:r>
-              <w:rPr>
-                <w:rFonts w:ascii="Times New Roman" w:hAnsi="Times New Roman" w:cs="Times New Roman"/>
-                <w:color w:val="404040" w:themeColor="text1" w:themeTint="BF"/>
-                <w:sz w:val="21"/>
-                <w:szCs w:val="21"/>
-              </w:rPr>
-              <w:t>, M. Gopal</w:t>
+              <w:t>, W. Poller, M. Gopal</w:t>
             </w:r>
             <w:r>
               <w:rPr>
@@ -3845,7 +3741,7 @@
                 <w:sz w:val="21"/>
                 <w:szCs w:val="21"/>
               </w:rPr>
-              <w:t>2024</w:t>
+              <w:t>2023</w:t>
             </w:r>
           </w:p>
         </w:tc>
@@ -3885,18 +3781,20 @@
                 <w:sz w:val="21"/>
                 <w:szCs w:val="21"/>
               </w:rPr>
-              <w:t>Type I IFN signaling limits CNS autoimmunity by modulating miR-21-Foxo1 axis in pathogenic Th17 cells</w:t>
-            </w:r>
-          </w:p>
-          <w:p>
-            <w:pPr>
-              <w:pStyle w:val="ListBullet"/>
-              <w:numPr>
-                <w:ilvl w:val="0"/>
-                <w:numId w:val="0"/>
-              </w:numPr>
-              <w:spacing w:after="60"/>
-              <w:ind w:left="1" w:hanging="1"/>
+              <w:t xml:space="preserve">Protocol for analyzing transforming growth factor </w:t>
+            </w:r>
+            <w:r>
+              <w:rPr>
+                <w:rFonts w:ascii="Times New Roman" w:hAnsi="Times New Roman" w:cs="Times New Roman"/>
+                <w:b/>
+                <w:bCs/>
+                <w:color w:val="404040" w:themeColor="text1" w:themeTint="BF"/>
+                <w:sz w:val="21"/>
+                <w:szCs w:val="21"/>
+              </w:rPr>
+              <w:t>β</w:t>
+            </w:r>
+            <w:r>
               <w:rPr>
                 <w:rFonts w:ascii="Times New Roman" w:hAnsi="Times New Roman" w:cs="Times New Roman"/>
                 <w:b/>
@@ -3907,55 +3805,37 @@
                 <w:sz w:val="21"/>
                 <w:szCs w:val="21"/>
               </w:rPr>
-            </w:pPr>
-            <w:r>
-              <w:rPr>
-                <w:rFonts w:ascii="Times New Roman" w:hAnsi="Times New Roman" w:cs="Times New Roman"/>
-                <w:color w:val="404040" w:themeColor="text1" w:themeTint="BF"/>
-                <w:sz w:val="21"/>
-                <w:szCs w:val="21"/>
-              </w:rPr>
-              <w:t xml:space="preserve">M. Fujiwara, J. Varghese, A. Cannon, L. Garo, A. K. Ajay, R. </w:t>
-            </w:r>
-            <w:proofErr w:type="spellStart"/>
-            <w:r>
-              <w:rPr>
-                <w:rFonts w:ascii="Times New Roman" w:hAnsi="Times New Roman" w:cs="Times New Roman"/>
-                <w:color w:val="404040" w:themeColor="text1" w:themeTint="BF"/>
-                <w:sz w:val="21"/>
-                <w:szCs w:val="21"/>
-              </w:rPr>
-              <w:t>Kadowaki</w:t>
-            </w:r>
-            <w:proofErr w:type="spellEnd"/>
-            <w:r>
-              <w:rPr>
-                <w:rFonts w:ascii="Times New Roman" w:hAnsi="Times New Roman" w:cs="Times New Roman"/>
-                <w:color w:val="404040" w:themeColor="text1" w:themeTint="BF"/>
-                <w:sz w:val="21"/>
-                <w:szCs w:val="21"/>
-              </w:rPr>
-              <w:t xml:space="preserve">-Saga, G. </w:t>
-            </w:r>
-            <w:proofErr w:type="spellStart"/>
-            <w:r>
-              <w:rPr>
-                <w:rFonts w:ascii="Times New Roman" w:hAnsi="Times New Roman" w:cs="Times New Roman"/>
-                <w:color w:val="404040" w:themeColor="text1" w:themeTint="BF"/>
-                <w:sz w:val="21"/>
-                <w:szCs w:val="21"/>
-              </w:rPr>
-              <w:t>Gabriely</w:t>
-            </w:r>
-            <w:proofErr w:type="spellEnd"/>
-            <w:r>
-              <w:rPr>
-                <w:rFonts w:ascii="Times New Roman" w:hAnsi="Times New Roman" w:cs="Times New Roman"/>
-                <w:color w:val="404040" w:themeColor="text1" w:themeTint="BF"/>
-                <w:sz w:val="21"/>
-                <w:szCs w:val="21"/>
-              </w:rPr>
-              <w:t xml:space="preserve">, </w:t>
+              <w:t xml:space="preserve"> signaling in dextran-sulfate-sodium-induced colitic mice using flow cytometry and western blotting</w:t>
+            </w:r>
+          </w:p>
+          <w:p>
+            <w:pPr>
+              <w:pStyle w:val="ListBullet"/>
+              <w:numPr>
+                <w:ilvl w:val="0"/>
+                <w:numId w:val="0"/>
+              </w:numPr>
+              <w:spacing w:after="60"/>
+              <w:ind w:left="1" w:hanging="1"/>
+              <w:rPr>
+                <w:rFonts w:ascii="Times New Roman" w:hAnsi="Times New Roman" w:cs="Times New Roman"/>
+                <w:b/>
+                <w:bCs/>
+                <w:i/>
+                <w:iCs/>
+                <w:color w:val="404040" w:themeColor="text1" w:themeTint="BF"/>
+                <w:sz w:val="21"/>
+                <w:szCs w:val="21"/>
+              </w:rPr>
+            </w:pPr>
+            <w:r>
+              <w:rPr>
+                <w:rFonts w:ascii="Times New Roman" w:hAnsi="Times New Roman" w:cs="Times New Roman"/>
+                <w:color w:val="404040" w:themeColor="text1" w:themeTint="BF"/>
+                <w:sz w:val="21"/>
+                <w:szCs w:val="21"/>
+              </w:rPr>
+              <w:t xml:space="preserve">M. Fujiwara, L. Garo, A. k. Ajay, A. Cannon, P. Kolyapetri, </w:t>
             </w:r>
             <w:r>
               <w:rPr>
@@ -3975,7 +3855,27 @@
                 <w:sz w:val="21"/>
                 <w:szCs w:val="21"/>
               </w:rPr>
-              <w:t xml:space="preserve">, et. al. (in preparation) </w:t>
+              <w:t xml:space="preserve">, G. Murugaiyan, </w:t>
+            </w:r>
+            <w:r>
+              <w:rPr>
+                <w:rFonts w:ascii="Times New Roman" w:hAnsi="Times New Roman" w:cs="Times New Roman"/>
+                <w:i/>
+                <w:iCs/>
+                <w:color w:val="404040" w:themeColor="text1" w:themeTint="BF"/>
+                <w:sz w:val="21"/>
+                <w:szCs w:val="21"/>
+              </w:rPr>
+              <w:t>Star Protocol,</w:t>
+            </w:r>
+            <w:r>
+              <w:rPr>
+                <w:rFonts w:ascii="Times New Roman" w:hAnsi="Times New Roman" w:cs="Times New Roman"/>
+                <w:color w:val="404040" w:themeColor="text1" w:themeTint="BF"/>
+                <w:sz w:val="21"/>
+                <w:szCs w:val="21"/>
+              </w:rPr>
+              <w:t xml:space="preserve"> 2023</w:t>
             </w:r>
           </w:p>
         </w:tc>
@@ -4012,7 +3912,7 @@
                 <w:sz w:val="21"/>
                 <w:szCs w:val="21"/>
               </w:rPr>
-              <w:t>2023</w:t>
+              <w:t>2022</w:t>
             </w:r>
           </w:p>
         </w:tc>
@@ -4032,6 +3932,14 @@
               <w:ind w:left="1" w:hanging="1"/>
               <w:rPr>
                 <w:rFonts w:ascii="Times New Roman" w:hAnsi="Times New Roman" w:cs="Times New Roman"/>
+                <w:color w:val="404040" w:themeColor="text1" w:themeTint="BF"/>
+                <w:sz w:val="21"/>
+                <w:szCs w:val="21"/>
+              </w:rPr>
+            </w:pPr>
+            <w:r>
+              <w:rPr>
+                <w:rFonts w:ascii="Times New Roman" w:hAnsi="Times New Roman" w:cs="Times New Roman"/>
                 <w:b/>
                 <w:bCs/>
                 <w:i/>
@@ -4040,8 +3948,18 @@
                 <w:sz w:val="21"/>
                 <w:szCs w:val="21"/>
               </w:rPr>
-            </w:pPr>
-            <w:r>
+              <w:t>MicroRNA effects on Gut Homeostasis: therapeutic Implications for Inflammatory Bowel Disease</w:t>
+            </w:r>
+          </w:p>
+          <w:p>
+            <w:pPr>
+              <w:pStyle w:val="ListBullet"/>
+              <w:numPr>
+                <w:ilvl w:val="0"/>
+                <w:numId w:val="0"/>
+              </w:numPr>
+              <w:spacing w:after="60"/>
+              <w:ind w:left="1" w:hanging="1"/>
               <w:rPr>
                 <w:rFonts w:ascii="Times New Roman" w:hAnsi="Times New Roman" w:cs="Times New Roman"/>
                 <w:b/>
@@ -4052,141 +3970,55 @@
                 <w:sz w:val="21"/>
                 <w:szCs w:val="21"/>
               </w:rPr>
-              <w:t xml:space="preserve">Protocol for analyzing transforming growth factor </w:t>
-            </w:r>
-            <w:r>
-              <w:rPr>
-                <w:rFonts w:ascii="Times New Roman" w:hAnsi="Times New Roman" w:cs="Times New Roman"/>
-                <w:b/>
-                <w:bCs/>
-                <w:color w:val="404040" w:themeColor="text1" w:themeTint="BF"/>
-                <w:sz w:val="21"/>
-                <w:szCs w:val="21"/>
-              </w:rPr>
-              <w:t>β</w:t>
-            </w:r>
-            <w:r>
-              <w:rPr>
-                <w:rFonts w:ascii="Times New Roman" w:hAnsi="Times New Roman" w:cs="Times New Roman"/>
-                <w:b/>
-                <w:bCs/>
+            </w:pPr>
+            <w:r>
+              <w:rPr>
+                <w:rFonts w:ascii="Times New Roman" w:hAnsi="Times New Roman" w:cs="Times New Roman"/>
+                <w:b/>
+                <w:bCs/>
+                <w:color w:val="941100"/>
+                <w:sz w:val="21"/>
+                <w:szCs w:val="21"/>
+              </w:rPr>
+              <w:t>S. Dhuppar</w:t>
+            </w:r>
+            <w:r>
+              <w:rPr>
+                <w:rFonts w:ascii="Times New Roman" w:hAnsi="Times New Roman" w:cs="Times New Roman"/>
+                <w:color w:val="941100"/>
+                <w:sz w:val="21"/>
+                <w:szCs w:val="21"/>
+              </w:rPr>
+              <w:t xml:space="preserve"> </w:t>
+            </w:r>
+            <w:r>
+              <w:rPr>
+                <w:rFonts w:ascii="Times New Roman" w:hAnsi="Times New Roman" w:cs="Times New Roman"/>
+                <w:color w:val="404040" w:themeColor="text1" w:themeTint="BF"/>
+                <w:sz w:val="21"/>
+                <w:szCs w:val="21"/>
+              </w:rPr>
+              <w:t xml:space="preserve">and M. Gopal, </w:t>
+            </w:r>
+            <w:r>
+              <w:rPr>
+                <w:rFonts w:ascii="Times New Roman" w:hAnsi="Times New Roman" w:cs="Times New Roman"/>
                 <w:i/>
                 <w:iCs/>
                 <w:color w:val="404040" w:themeColor="text1" w:themeTint="BF"/>
                 <w:sz w:val="21"/>
                 <w:szCs w:val="21"/>
               </w:rPr>
-              <w:t xml:space="preserve"> signaling in dextran-sulfate-sodium-induced colitic mice using flow cytometry and western blotting</w:t>
-            </w:r>
-          </w:p>
-          <w:p>
-            <w:pPr>
-              <w:pStyle w:val="ListBullet"/>
-              <w:numPr>
-                <w:ilvl w:val="0"/>
-                <w:numId w:val="0"/>
-              </w:numPr>
-              <w:spacing w:after="60"/>
-              <w:ind w:left="1" w:hanging="1"/>
-              <w:rPr>
-                <w:rFonts w:ascii="Times New Roman" w:hAnsi="Times New Roman" w:cs="Times New Roman"/>
-                <w:b/>
-                <w:bCs/>
-                <w:i/>
-                <w:iCs/>
-                <w:color w:val="404040" w:themeColor="text1" w:themeTint="BF"/>
-                <w:sz w:val="21"/>
-                <w:szCs w:val="21"/>
-              </w:rPr>
-            </w:pPr>
-            <w:r>
-              <w:rPr>
-                <w:rFonts w:ascii="Times New Roman" w:hAnsi="Times New Roman" w:cs="Times New Roman"/>
-                <w:color w:val="404040" w:themeColor="text1" w:themeTint="BF"/>
-                <w:sz w:val="21"/>
-                <w:szCs w:val="21"/>
-              </w:rPr>
-              <w:t xml:space="preserve">M. Fujiwara, L. Garo, A. k. Ajay, A. Cannon, P. </w:t>
-            </w:r>
-            <w:proofErr w:type="spellStart"/>
-            <w:r>
-              <w:rPr>
-                <w:rFonts w:ascii="Times New Roman" w:hAnsi="Times New Roman" w:cs="Times New Roman"/>
-                <w:color w:val="404040" w:themeColor="text1" w:themeTint="BF"/>
-                <w:sz w:val="21"/>
-                <w:szCs w:val="21"/>
-              </w:rPr>
-              <w:t>Kolyapetri</w:t>
-            </w:r>
-            <w:proofErr w:type="spellEnd"/>
-            <w:r>
-              <w:rPr>
-                <w:rFonts w:ascii="Times New Roman" w:hAnsi="Times New Roman" w:cs="Times New Roman"/>
-                <w:color w:val="404040" w:themeColor="text1" w:themeTint="BF"/>
-                <w:sz w:val="21"/>
-                <w:szCs w:val="21"/>
-              </w:rPr>
-              <w:t xml:space="preserve">, </w:t>
-            </w:r>
-            <w:r>
-              <w:rPr>
-                <w:rFonts w:ascii="Times New Roman" w:hAnsi="Times New Roman" w:cs="Times New Roman"/>
-                <w:b/>
-                <w:bCs/>
-                <w:color w:val="941100"/>
-                <w:sz w:val="21"/>
-                <w:szCs w:val="21"/>
-              </w:rPr>
-              <w:t>S. Dhuppar</w:t>
-            </w:r>
-            <w:r>
-              <w:rPr>
-                <w:rFonts w:ascii="Times New Roman" w:hAnsi="Times New Roman" w:cs="Times New Roman"/>
-                <w:color w:val="404040" w:themeColor="text1" w:themeTint="BF"/>
-                <w:sz w:val="21"/>
-                <w:szCs w:val="21"/>
-              </w:rPr>
-              <w:t xml:space="preserve">, G. </w:t>
-            </w:r>
-            <w:proofErr w:type="spellStart"/>
-            <w:r>
-              <w:rPr>
-                <w:rFonts w:ascii="Times New Roman" w:hAnsi="Times New Roman" w:cs="Times New Roman"/>
-                <w:color w:val="404040" w:themeColor="text1" w:themeTint="BF"/>
-                <w:sz w:val="21"/>
-                <w:szCs w:val="21"/>
-              </w:rPr>
-              <w:t>Murugaiyan</w:t>
-            </w:r>
-            <w:proofErr w:type="spellEnd"/>
-            <w:r>
-              <w:rPr>
-                <w:rFonts w:ascii="Times New Roman" w:hAnsi="Times New Roman" w:cs="Times New Roman"/>
-                <w:color w:val="404040" w:themeColor="text1" w:themeTint="BF"/>
-                <w:sz w:val="21"/>
-                <w:szCs w:val="21"/>
-              </w:rPr>
-              <w:t xml:space="preserve">, </w:t>
-            </w:r>
-            <w:r>
-              <w:rPr>
-                <w:rFonts w:ascii="Times New Roman" w:hAnsi="Times New Roman" w:cs="Times New Roman"/>
-                <w:i/>
-                <w:iCs/>
-                <w:color w:val="404040" w:themeColor="text1" w:themeTint="BF"/>
-                <w:sz w:val="21"/>
-                <w:szCs w:val="21"/>
-              </w:rPr>
-              <w:t>Star Protocol,</w:t>
-            </w:r>
-            <w:r>
-              <w:rPr>
-                <w:rFonts w:ascii="Times New Roman" w:hAnsi="Times New Roman" w:cs="Times New Roman"/>
-                <w:color w:val="404040" w:themeColor="text1" w:themeTint="BF"/>
-                <w:sz w:val="21"/>
-                <w:szCs w:val="21"/>
-              </w:rPr>
-              <w:t xml:space="preserve"> 2023</w:t>
+              <w:t>Trends in Immunology</w:t>
+            </w:r>
+            <w:r>
+              <w:rPr>
+                <w:rFonts w:ascii="Times New Roman" w:hAnsi="Times New Roman" w:cs="Times New Roman"/>
+                <w:color w:val="404040" w:themeColor="text1" w:themeTint="BF"/>
+                <w:sz w:val="21"/>
+                <w:szCs w:val="21"/>
+              </w:rPr>
+              <w:t>, 2022</w:t>
             </w:r>
           </w:p>
         </w:tc>
@@ -4223,7 +4055,7 @@
                 <w:sz w:val="21"/>
                 <w:szCs w:val="21"/>
               </w:rPr>
-              <w:t>2022</w:t>
+              <w:t>2020</w:t>
             </w:r>
           </w:p>
         </w:tc>
@@ -4259,7 +4091,7 @@
                 <w:sz w:val="21"/>
                 <w:szCs w:val="21"/>
               </w:rPr>
-              <w:t>MicroRNA effects on Gut Homeostasis: therapeutic Implications for Inflammatory Bowel Disease</w:t>
+              <w:t>Investigating Cell Cycle-Dependent Gene Expression in the Context of Nuclear Architecture at a Single-Allele Resolution</w:t>
             </w:r>
           </w:p>
           <w:p>
@@ -4291,7 +4123,7 @@
                 <w:sz w:val="21"/>
                 <w:szCs w:val="21"/>
               </w:rPr>
-              <w:t>S. Dhuppar</w:t>
+              <w:t>S. Dhuppar*</w:t>
             </w:r>
             <w:r>
               <w:rPr>
@@ -4309,7 +4141,7 @@
                 <w:sz w:val="21"/>
                 <w:szCs w:val="21"/>
               </w:rPr>
-              <w:t xml:space="preserve">and M. Gopal, </w:t>
+              <w:t xml:space="preserve">and A. Mazumder*, </w:t>
             </w:r>
             <w:r>
               <w:rPr>
@@ -4320,16 +4152,16 @@
                 <w:sz w:val="21"/>
                 <w:szCs w:val="21"/>
               </w:rPr>
-              <w:t>Trends in Immunology</w:t>
-            </w:r>
-            <w:r>
-              <w:rPr>
-                <w:rFonts w:ascii="Times New Roman" w:hAnsi="Times New Roman" w:cs="Times New Roman"/>
-                <w:color w:val="404040" w:themeColor="text1" w:themeTint="BF"/>
-                <w:sz w:val="21"/>
-                <w:szCs w:val="21"/>
-              </w:rPr>
-              <w:t>, 2022</w:t>
+              <w:t>Journal of Cell Science</w:t>
+            </w:r>
+            <w:r>
+              <w:rPr>
+                <w:rFonts w:ascii="Times New Roman" w:hAnsi="Times New Roman" w:cs="Times New Roman"/>
+                <w:color w:val="404040" w:themeColor="text1" w:themeTint="BF"/>
+                <w:sz w:val="21"/>
+                <w:szCs w:val="21"/>
+              </w:rPr>
+              <w:t>, 2020</w:t>
             </w:r>
           </w:p>
         </w:tc>
@@ -4384,7 +4216,6 @@
                 <w:numId w:val="0"/>
               </w:numPr>
               <w:spacing w:after="60"/>
-              <w:ind w:left="1" w:hanging="1"/>
               <w:rPr>
                 <w:rFonts w:ascii="Times New Roman" w:hAnsi="Times New Roman" w:cs="Times New Roman"/>
                 <w:color w:val="404040" w:themeColor="text1" w:themeTint="BF"/>
@@ -4403,18 +4234,9 @@
                 <w:sz w:val="21"/>
                 <w:szCs w:val="21"/>
               </w:rPr>
-              <w:t>Investigating Cell Cycle-Dependent Gene Expression in the Context of Nuclear Architecture at a Single-Allele Resolution</w:t>
-            </w:r>
-          </w:p>
-          <w:p>
-            <w:pPr>
-              <w:pStyle w:val="ListBullet"/>
-              <w:numPr>
-                <w:ilvl w:val="0"/>
-                <w:numId w:val="0"/>
-              </w:numPr>
-              <w:spacing w:after="60"/>
-              <w:ind w:left="1" w:hanging="1"/>
+              <w:sym w:font="Symbol" w:char="F067"/>
+            </w:r>
+            <w:r>
               <w:rPr>
                 <w:rFonts w:ascii="Times New Roman" w:hAnsi="Times New Roman" w:cs="Times New Roman"/>
                 <w:b/>
@@ -4425,55 +4247,47 @@
                 <w:sz w:val="21"/>
                 <w:szCs w:val="21"/>
               </w:rPr>
-            </w:pPr>
-            <w:r>
-              <w:rPr>
-                <w:rFonts w:ascii="Times New Roman" w:hAnsi="Times New Roman" w:cs="Times New Roman"/>
-                <w:b/>
-                <w:bCs/>
-                <w:color w:val="941100"/>
-                <w:sz w:val="21"/>
-                <w:szCs w:val="21"/>
-              </w:rPr>
-              <w:t>S. Dhuppar*</w:t>
-            </w:r>
-            <w:r>
-              <w:rPr>
-                <w:rFonts w:ascii="Times New Roman" w:hAnsi="Times New Roman" w:cs="Times New Roman"/>
-                <w:color w:val="941100"/>
-                <w:sz w:val="21"/>
-                <w:szCs w:val="21"/>
-              </w:rPr>
-              <w:t xml:space="preserve"> </w:t>
-            </w:r>
-            <w:r>
-              <w:rPr>
-                <w:rFonts w:ascii="Times New Roman" w:hAnsi="Times New Roman" w:cs="Times New Roman"/>
-                <w:color w:val="404040" w:themeColor="text1" w:themeTint="BF"/>
-                <w:sz w:val="21"/>
-                <w:szCs w:val="21"/>
-              </w:rPr>
-              <w:t xml:space="preserve">and A. Mazumder*, </w:t>
-            </w:r>
-            <w:r>
-              <w:rPr>
-                <w:rFonts w:ascii="Times New Roman" w:hAnsi="Times New Roman" w:cs="Times New Roman"/>
+              <w:t>H2AX Peak in the S Phase After UV Irradiation Corresponds to DNA Replication and Does not Report on the Extent of DNA Damage</w:t>
+            </w:r>
+          </w:p>
+          <w:p>
+            <w:pPr>
+              <w:pStyle w:val="ListBullet"/>
+              <w:numPr>
+                <w:ilvl w:val="0"/>
+                <w:numId w:val="0"/>
+              </w:numPr>
+              <w:spacing w:after="60"/>
+              <w:rPr>
+                <w:rFonts w:ascii="Times New Roman" w:hAnsi="Times New Roman" w:cs="Times New Roman"/>
+                <w:b/>
+                <w:bCs/>
                 <w:i/>
                 <w:iCs/>
                 <w:color w:val="404040" w:themeColor="text1" w:themeTint="BF"/>
                 <w:sz w:val="21"/>
                 <w:szCs w:val="21"/>
               </w:rPr>
-              <w:t>Journal of Cell Science</w:t>
-            </w:r>
-            <w:r>
-              <w:rPr>
-                <w:rFonts w:ascii="Times New Roman" w:hAnsi="Times New Roman" w:cs="Times New Roman"/>
-                <w:color w:val="404040" w:themeColor="text1" w:themeTint="BF"/>
-                <w:sz w:val="21"/>
-                <w:szCs w:val="21"/>
-              </w:rPr>
-              <w:t>, 2020</w:t>
+            </w:pPr>
+            <w:r>
+              <w:rPr>
+                <w:rFonts w:ascii="Times New Roman" w:hAnsi="Times New Roman" w:cs="Times New Roman"/>
+                <w:b/>
+                <w:bCs/>
+                <w:color w:val="941100"/>
+                <w:sz w:val="21"/>
+                <w:szCs w:val="21"/>
+              </w:rPr>
+              <w:t>S. Dhuppar*</w:t>
+            </w:r>
+            <w:r>
+              <w:rPr>
+                <w:rFonts w:ascii="Times New Roman" w:hAnsi="Times New Roman" w:cs="Times New Roman"/>
+                <w:color w:val="404040" w:themeColor="text1" w:themeTint="BF"/>
+                <w:sz w:val="21"/>
+                <w:szCs w:val="21"/>
+              </w:rPr>
+              <w:t>, S. Roy and A. Mazumder*, Molecular and Cellular Biology, 2020</w:t>
             </w:r>
           </w:p>
         </w:tc>
@@ -4545,9 +4359,17 @@
                 <w:sz w:val="21"/>
                 <w:szCs w:val="21"/>
               </w:rPr>
-              <w:sym w:font="Symbol" w:char="F067"/>
-            </w:r>
-            <w:r>
+              <w:t>CTCF Mediated Genome Architecture Regulates the Dosage of Mitotically Stable monoallelic Expression of Autosomal Genes</w:t>
+            </w:r>
+          </w:p>
+          <w:p>
+            <w:pPr>
+              <w:pStyle w:val="ListBullet"/>
+              <w:numPr>
+                <w:ilvl w:val="0"/>
+                <w:numId w:val="0"/>
+              </w:numPr>
+              <w:spacing w:after="60"/>
               <w:rPr>
                 <w:rFonts w:ascii="Times New Roman" w:hAnsi="Times New Roman" w:cs="Times New Roman"/>
                 <w:b/>
@@ -4558,28 +4380,16 @@
                 <w:sz w:val="21"/>
                 <w:szCs w:val="21"/>
               </w:rPr>
-              <w:t>H2AX Peak in the S Phase After UV Irradiation Corresponds to DNA Replication and Does not Report on the Extent of DNA Damage</w:t>
-            </w:r>
-          </w:p>
-          <w:p>
-            <w:pPr>
-              <w:pStyle w:val="ListBullet"/>
-              <w:numPr>
-                <w:ilvl w:val="0"/>
-                <w:numId w:val="0"/>
-              </w:numPr>
-              <w:spacing w:after="60"/>
-              <w:rPr>
-                <w:rFonts w:ascii="Times New Roman" w:hAnsi="Times New Roman" w:cs="Times New Roman"/>
-                <w:b/>
-                <w:bCs/>
-                <w:i/>
-                <w:iCs/>
-                <w:color w:val="404040" w:themeColor="text1" w:themeTint="BF"/>
-                <w:sz w:val="21"/>
-                <w:szCs w:val="21"/>
-              </w:rPr>
-            </w:pPr>
+            </w:pPr>
+            <w:r>
+              <w:rPr>
+                <w:rFonts w:ascii="Times New Roman" w:hAnsi="Times New Roman" w:cs="Times New Roman"/>
+                <w:color w:val="404040" w:themeColor="text1" w:themeTint="BF"/>
+                <w:sz w:val="21"/>
+                <w:szCs w:val="21"/>
+              </w:rPr>
+              <w:t xml:space="preserve">K. R. Chandradoss, B. Chawla, </w:t>
+            </w:r>
             <w:r>
               <w:rPr>
                 <w:rFonts w:ascii="Times New Roman" w:hAnsi="Times New Roman" w:cs="Times New Roman"/>
@@ -4589,147 +4399,6 @@
                 <w:sz w:val="21"/>
                 <w:szCs w:val="21"/>
               </w:rPr>
-              <w:t>S. Dhuppar*</w:t>
-            </w:r>
-            <w:r>
-              <w:rPr>
-                <w:rFonts w:ascii="Times New Roman" w:hAnsi="Times New Roman" w:cs="Times New Roman"/>
-                <w:color w:val="404040" w:themeColor="text1" w:themeTint="BF"/>
-                <w:sz w:val="21"/>
-                <w:szCs w:val="21"/>
-              </w:rPr>
-              <w:t>, S. Roy and A. Mazumder*, Molecular and Cellular Biology, 2020</w:t>
-            </w:r>
-          </w:p>
-        </w:tc>
-      </w:tr>
-      <w:tr>
-        <w:tc>
-          <w:tcPr>
-            <w:tcW w:w="1042" w:type="dxa"/>
-          </w:tcPr>
-          <w:p>
-            <w:pPr>
-              <w:pStyle w:val="ListBullet"/>
-              <w:numPr>
-                <w:ilvl w:val="0"/>
-                <w:numId w:val="0"/>
-              </w:numPr>
-              <w:spacing w:after="60"/>
-              <w:jc w:val="right"/>
-              <w:rPr>
-                <w:rFonts w:ascii="Times New Roman" w:hAnsi="Times New Roman" w:cs="Times New Roman"/>
-                <w:b/>
-                <w:bCs/>
-                <w:color w:val="404040" w:themeColor="text1" w:themeTint="BF"/>
-                <w:sz w:val="21"/>
-                <w:szCs w:val="21"/>
-              </w:rPr>
-            </w:pPr>
-            <w:r>
-              <w:rPr>
-                <w:rFonts w:ascii="Times New Roman" w:hAnsi="Times New Roman" w:cs="Times New Roman"/>
-                <w:b/>
-                <w:bCs/>
-                <w:color w:val="404040" w:themeColor="text1" w:themeTint="BF"/>
-                <w:sz w:val="21"/>
-                <w:szCs w:val="21"/>
-              </w:rPr>
-              <w:t>2020</w:t>
-            </w:r>
-          </w:p>
-        </w:tc>
-        <w:tc>
-          <w:tcPr>
-            <w:tcW w:w="9232" w:type="dxa"/>
-            <w:gridSpan w:val="2"/>
-          </w:tcPr>
-          <w:p>
-            <w:pPr>
-              <w:pStyle w:val="ListBullet"/>
-              <w:numPr>
-                <w:ilvl w:val="0"/>
-                <w:numId w:val="0"/>
-              </w:numPr>
-              <w:spacing w:after="60"/>
-              <w:rPr>
-                <w:rFonts w:ascii="Times New Roman" w:hAnsi="Times New Roman" w:cs="Times New Roman"/>
-                <w:color w:val="404040" w:themeColor="text1" w:themeTint="BF"/>
-                <w:sz w:val="21"/>
-                <w:szCs w:val="21"/>
-              </w:rPr>
-            </w:pPr>
-            <w:r>
-              <w:rPr>
-                <w:rFonts w:ascii="Times New Roman" w:hAnsi="Times New Roman" w:cs="Times New Roman"/>
-                <w:b/>
-                <w:bCs/>
-                <w:i/>
-                <w:iCs/>
-                <w:color w:val="404040" w:themeColor="text1" w:themeTint="BF"/>
-                <w:sz w:val="21"/>
-                <w:szCs w:val="21"/>
-              </w:rPr>
-              <w:t>CTCF Mediated Genome Architecture Regulates the Dosage of Mitotically Stable monoallelic Expression of Autosomal Genes</w:t>
-            </w:r>
-          </w:p>
-          <w:p>
-            <w:pPr>
-              <w:pStyle w:val="ListBullet"/>
-              <w:numPr>
-                <w:ilvl w:val="0"/>
-                <w:numId w:val="0"/>
-              </w:numPr>
-              <w:spacing w:after="60"/>
-              <w:rPr>
-                <w:rFonts w:ascii="Times New Roman" w:hAnsi="Times New Roman" w:cs="Times New Roman"/>
-                <w:b/>
-                <w:bCs/>
-                <w:i/>
-                <w:iCs/>
-                <w:color w:val="404040" w:themeColor="text1" w:themeTint="BF"/>
-                <w:sz w:val="21"/>
-                <w:szCs w:val="21"/>
-              </w:rPr>
-            </w:pPr>
-            <w:r>
-              <w:rPr>
-                <w:rFonts w:ascii="Times New Roman" w:hAnsi="Times New Roman" w:cs="Times New Roman"/>
-                <w:color w:val="404040" w:themeColor="text1" w:themeTint="BF"/>
-                <w:sz w:val="21"/>
-                <w:szCs w:val="21"/>
-              </w:rPr>
-              <w:t xml:space="preserve">K. R. </w:t>
-            </w:r>
-            <w:proofErr w:type="spellStart"/>
-            <w:r>
-              <w:rPr>
-                <w:rFonts w:ascii="Times New Roman" w:hAnsi="Times New Roman" w:cs="Times New Roman"/>
-                <w:color w:val="404040" w:themeColor="text1" w:themeTint="BF"/>
-                <w:sz w:val="21"/>
-                <w:szCs w:val="21"/>
-              </w:rPr>
-              <w:t>Chandradoss</w:t>
-            </w:r>
-            <w:proofErr w:type="spellEnd"/>
-            <w:r>
-              <w:rPr>
-                <w:rFonts w:ascii="Times New Roman" w:hAnsi="Times New Roman" w:cs="Times New Roman"/>
-                <w:color w:val="404040" w:themeColor="text1" w:themeTint="BF"/>
-                <w:sz w:val="21"/>
-                <w:szCs w:val="21"/>
-              </w:rPr>
-              <w:t xml:space="preserve">, B. Chawla, </w:t>
-            </w:r>
-            <w:r>
-              <w:rPr>
-                <w:rFonts w:ascii="Times New Roman" w:hAnsi="Times New Roman" w:cs="Times New Roman"/>
-                <w:b/>
-                <w:bCs/>
-                <w:color w:val="941100"/>
-                <w:sz w:val="21"/>
-                <w:szCs w:val="21"/>
-              </w:rPr>
               <w:t>S. Dhuppar</w:t>
             </w:r>
             <w:r>
@@ -4739,27 +4408,7 @@
                 <w:sz w:val="21"/>
                 <w:szCs w:val="21"/>
               </w:rPr>
-              <w:t xml:space="preserve">, R. Nayak, R. Ramachandran, S. </w:t>
-            </w:r>
-            <w:proofErr w:type="spellStart"/>
-            <w:r>
-              <w:rPr>
-                <w:rFonts w:ascii="Times New Roman" w:hAnsi="Times New Roman" w:cs="Times New Roman"/>
-                <w:color w:val="404040" w:themeColor="text1" w:themeTint="BF"/>
-                <w:sz w:val="21"/>
-                <w:szCs w:val="21"/>
-              </w:rPr>
-              <w:t>Kurukuti</w:t>
-            </w:r>
-            <w:proofErr w:type="spellEnd"/>
-            <w:r>
-              <w:rPr>
-                <w:rFonts w:ascii="Times New Roman" w:hAnsi="Times New Roman" w:cs="Times New Roman"/>
-                <w:color w:val="404040" w:themeColor="text1" w:themeTint="BF"/>
-                <w:sz w:val="21"/>
-                <w:szCs w:val="21"/>
-              </w:rPr>
-              <w:t>, A. Mazumder, and K. S. Sandhu, Cell Reports, 2020</w:t>
+              <w:t>, R. Nayak, R. Ramachandran, S. Kurukuti, A. Mazumder, and K. S. Sandhu, Cell Reports, 2020</w:t>
             </w:r>
           </w:p>
         </w:tc>
@@ -5425,31 +5074,7 @@
                 <w:sz w:val="21"/>
                 <w:szCs w:val="21"/>
               </w:rPr>
-              <w:t xml:space="preserve">4D </w:t>
-            </w:r>
-            <w:proofErr w:type="spellStart"/>
-            <w:r>
-              <w:rPr>
-                <w:rFonts w:ascii="Times New Roman" w:hAnsi="Times New Roman" w:cs="Times New Roman"/>
-                <w:b/>
-                <w:bCs/>
-                <w:color w:val="404040" w:themeColor="text1" w:themeTint="BF"/>
-                <w:sz w:val="21"/>
-                <w:szCs w:val="21"/>
-              </w:rPr>
-              <w:t>Nucleome</w:t>
-            </w:r>
-            <w:proofErr w:type="spellEnd"/>
-            <w:r>
-              <w:rPr>
-                <w:rFonts w:ascii="Times New Roman" w:hAnsi="Times New Roman" w:cs="Times New Roman"/>
-                <w:b/>
-                <w:bCs/>
-                <w:color w:val="404040" w:themeColor="text1" w:themeTint="BF"/>
-                <w:sz w:val="21"/>
-                <w:szCs w:val="21"/>
-              </w:rPr>
-              <w:t xml:space="preserve"> Project, NIH common funds</w:t>
+              <w:t>4D Nucleome Project, NIH common funds</w:t>
             </w:r>
           </w:p>
         </w:tc>
@@ -5641,27 +5266,7 @@
                 <w:sz w:val="21"/>
                 <w:szCs w:val="21"/>
               </w:rPr>
-              <w:t xml:space="preserve"> data (</w:t>
-            </w:r>
-            <w:proofErr w:type="spellStart"/>
-            <w:r>
-              <w:rPr>
-                <w:rFonts w:ascii="Times New Roman" w:hAnsi="Times New Roman" w:cs="Times New Roman"/>
-                <w:color w:val="404040" w:themeColor="text1" w:themeTint="BF"/>
-                <w:sz w:val="21"/>
-                <w:szCs w:val="21"/>
-              </w:rPr>
-              <w:t>scRNA</w:t>
-            </w:r>
-            <w:proofErr w:type="spellEnd"/>
-            <w:r>
-              <w:rPr>
-                <w:rFonts w:ascii="Times New Roman" w:hAnsi="Times New Roman" w:cs="Times New Roman"/>
-                <w:color w:val="404040" w:themeColor="text1" w:themeTint="BF"/>
-                <w:sz w:val="21"/>
-                <w:szCs w:val="21"/>
-              </w:rPr>
-              <w:t xml:space="preserve"> seq, ATAC-seq, Hi-C)</w:t>
+              <w:t xml:space="preserve"> data (scRNA seq, ATAC-seq, Hi-C)</w:t>
             </w:r>
             <w:r>
               <w:rPr>
@@ -5705,27 +5310,7 @@
                 <w:sz w:val="21"/>
                 <w:szCs w:val="21"/>
               </w:rPr>
-              <w:t xml:space="preserve">- SLURM, Google GCP, </w:t>
-            </w:r>
-            <w:proofErr w:type="spellStart"/>
-            <w:r>
-              <w:rPr>
-                <w:rFonts w:ascii="Times New Roman" w:hAnsi="Times New Roman" w:cs="Times New Roman"/>
-                <w:color w:val="404040" w:themeColor="text1" w:themeTint="BF"/>
-                <w:sz w:val="21"/>
-                <w:szCs w:val="21"/>
-              </w:rPr>
-              <w:t>Apptainer</w:t>
-            </w:r>
-            <w:proofErr w:type="spellEnd"/>
-            <w:r>
-              <w:rPr>
-                <w:rFonts w:ascii="Times New Roman" w:hAnsi="Times New Roman" w:cs="Times New Roman"/>
-                <w:color w:val="404040" w:themeColor="text1" w:themeTint="BF"/>
-                <w:sz w:val="21"/>
-                <w:szCs w:val="21"/>
-              </w:rPr>
-              <w:t xml:space="preserve"> (Singularity), Bash/Linux, C</w:t>
+              <w:t>- SLURM, Google GCP, Apptainer (Singularity), Bash/Linux, C</w:t>
             </w:r>
             <w:r>
               <w:rPr>
@@ -5735,59 +5320,8 @@
                 <w:szCs w:val="21"/>
               </w:rPr>
               <w:br/>
-              <w:t xml:space="preserve">- AI/ML libraries: Scikit-learn, </w:t>
-            </w:r>
-            <w:proofErr w:type="spellStart"/>
-            <w:r>
-              <w:rPr>
-                <w:rFonts w:ascii="Times New Roman" w:hAnsi="Times New Roman" w:cs="Times New Roman"/>
-                <w:color w:val="404040" w:themeColor="text1" w:themeTint="BF"/>
-                <w:sz w:val="21"/>
-                <w:szCs w:val="21"/>
-              </w:rPr>
-              <w:t>Gensim</w:t>
-            </w:r>
-            <w:proofErr w:type="spellEnd"/>
-            <w:r>
-              <w:rPr>
-                <w:rFonts w:ascii="Times New Roman" w:hAnsi="Times New Roman" w:cs="Times New Roman"/>
-                <w:color w:val="404040" w:themeColor="text1" w:themeTint="BF"/>
-                <w:sz w:val="21"/>
-                <w:szCs w:val="21"/>
-              </w:rPr>
-              <w:t xml:space="preserve">, </w:t>
-            </w:r>
-            <w:proofErr w:type="spellStart"/>
-            <w:r>
-              <w:rPr>
-                <w:rFonts w:ascii="Times New Roman" w:hAnsi="Times New Roman" w:cs="Times New Roman"/>
-                <w:color w:val="404040" w:themeColor="text1" w:themeTint="BF"/>
-                <w:sz w:val="21"/>
-                <w:szCs w:val="21"/>
-              </w:rPr>
-              <w:t>RDKit</w:t>
-            </w:r>
-            <w:proofErr w:type="spellEnd"/>
-            <w:r>
-              <w:rPr>
-                <w:rFonts w:ascii="Times New Roman" w:hAnsi="Times New Roman" w:cs="Times New Roman"/>
-                <w:color w:val="404040" w:themeColor="text1" w:themeTint="BF"/>
-                <w:sz w:val="21"/>
-                <w:szCs w:val="21"/>
-              </w:rPr>
-              <w:t xml:space="preserve">, </w:t>
-            </w:r>
-            <w:proofErr w:type="spellStart"/>
-            <w:r>
-              <w:rPr>
-                <w:rFonts w:ascii="Times New Roman" w:hAnsi="Times New Roman" w:cs="Times New Roman"/>
-                <w:color w:val="404040" w:themeColor="text1" w:themeTint="BF"/>
-                <w:sz w:val="21"/>
-                <w:szCs w:val="21"/>
-              </w:rPr>
-              <w:t>PyTorch</w:t>
-            </w:r>
-            <w:proofErr w:type="spellEnd"/>
+              <w:t>- AI/ML libraries: Scikit-learn, Gensim, RDKit, PyTorch</w:t>
+            </w:r>
           </w:p>
           <w:p>
             <w:pPr>
@@ -5893,27 +5427,7 @@
                 <w:sz w:val="21"/>
                 <w:szCs w:val="21"/>
               </w:rPr>
-              <w:t xml:space="preserve"> (</w:t>
-            </w:r>
-            <w:proofErr w:type="spellStart"/>
-            <w:r>
-              <w:rPr>
-                <w:rFonts w:ascii="Times New Roman" w:hAnsi="Times New Roman" w:cs="Times New Roman"/>
-                <w:color w:val="404040" w:themeColor="text1" w:themeTint="BF"/>
-                <w:sz w:val="21"/>
-                <w:szCs w:val="21"/>
-              </w:rPr>
-              <w:t>LaVision</w:t>
-            </w:r>
-            <w:proofErr w:type="spellEnd"/>
-            <w:r>
-              <w:rPr>
-                <w:rFonts w:ascii="Times New Roman" w:hAnsi="Times New Roman" w:cs="Times New Roman"/>
-                <w:color w:val="404040" w:themeColor="text1" w:themeTint="BF"/>
-                <w:sz w:val="21"/>
-                <w:szCs w:val="21"/>
-              </w:rPr>
-              <w:t xml:space="preserve"> UMP II)</w:t>
+              <w:t xml:space="preserve"> (LaVision UMP II)</w:t>
             </w:r>
             <w:r>
               <w:rPr>

</xml_diff>